<commit_message>
Atualiza artigo com referência ao commit da entrega
</commit_message>
<xml_diff>
--- a/ARTIGO/ARTIGO-PHB-VAGAS.docx
+++ b/ARTIGO/ARTIGO-PHB-VAGAS.docx
@@ -1436,12 +1436,12 @@
           <wp:inline distB="114300" distT="114300" distL="114300" distR="114300">
             <wp:extent cx="5731200" cy="2870200"/>
             <wp:effectExtent b="0" l="0" r="0" t="0"/>
-            <wp:docPr id="1" name="image3.png"/>
+            <wp:docPr id="1" name="image1.png"/>
             <a:graphic>
               <a:graphicData uri="http://schemas.openxmlformats.org/drawingml/2006/picture">
                 <pic:pic>
                   <pic:nvPicPr>
-                    <pic:cNvPr id="0" name="image3.png"/>
+                    <pic:cNvPr id="0" name="image1.png"/>
                     <pic:cNvPicPr preferRelativeResize="0"/>
                   </pic:nvPicPr>
                   <pic:blipFill>
@@ -1873,12 +1873,12 @@
           <wp:inline distB="114300" distT="114300" distL="114300" distR="114300">
             <wp:extent cx="5731200" cy="1206500"/>
             <wp:effectExtent b="0" l="0" r="0" t="0"/>
-            <wp:docPr id="3" name="image1.png"/>
+            <wp:docPr id="3" name="image3.png"/>
             <a:graphic>
               <a:graphicData uri="http://schemas.openxmlformats.org/drawingml/2006/picture">
                 <pic:pic>
                   <pic:nvPicPr>
-                    <pic:cNvPr id="0" name="image1.png"/>
+                    <pic:cNvPr id="0" name="image3.png"/>
                     <pic:cNvPicPr preferRelativeResize="0"/>
                   </pic:nvPicPr>
                   <pic:blipFill>
@@ -2484,6 +2484,207 @@
     </w:p>
     <w:p>
       <w:pPr>
+        <w:pStyle w:val="Heading1"/>
+        <w:keepNext w:val="0"/>
+        <w:keepLines w:val="0"/>
+        <w:spacing w:before="480" w:line="360" w:lineRule="auto"/>
+        <w:ind w:left="0" w:firstLine="0"/>
+        <w:jc w:val="both"/>
+        <w:rPr>
+          <w:b w:val="1"/>
+          <w:bCs w:val="1"/>
+          <w:sz w:val="46"/>
+          <w:szCs w:val="46"/>
+        </w:rPr>
+      </w:pPr>
+      <w:bookmarkStart w:colFirst="0" w:colLast="0" w:name="_1r656rit1dhi" w:id="22"/>
+      <w:bookmarkEnd w:id="22"/>
+      <w:r>
+        <w:rPr>
+          <w:b w:val="1"/>
+          <w:bCs w:val="1"/>
+          <w:sz w:val="46"/>
+          <w:szCs w:val="46"/>
+          <w:rtl w:val="0"/>
+        </w:rPr>
+        <w:t xml:space="preserve">8 DISPONIBILIZAÇÃO DO PROJETO</w:t>
+      </w:r>
+    </w:p>
+    <w:p>
+      <w:pPr>
+        <w:spacing w:after="240" w:before="240" w:line="360" w:lineRule="auto"/>
+        <w:ind w:firstLine="720"/>
+        <w:jc w:val="both"/>
+        <w:rPr>
+          <w:sz w:val="24"/>
+          <w:szCs w:val="24"/>
+        </w:rPr>
+      </w:pPr>
+      <w:r>
+        <w:rPr>
+          <w:sz w:val="24"/>
+          <w:szCs w:val="24"/>
+          <w:rtl w:val="0"/>
+        </w:rPr>
+        <w:t xml:space="preserve">O código-fonte completo, o artigo científico e as imagens utilizadas neste trabalho encontram-se disponíveis no repositório GitHub do projeto:</w:t>
+      </w:r>
+    </w:p>
+    <w:p>
+      <w:pPr>
+        <w:spacing w:after="240" w:before="240" w:line="360" w:lineRule="auto"/>
+        <w:jc w:val="both"/>
+        <w:rPr>
+          <w:sz w:val="24"/>
+          <w:szCs w:val="24"/>
+        </w:rPr>
+      </w:pPr>
+      <w:r>
+        <w:rPr>
+          <w:sz w:val="24"/>
+          <w:szCs w:val="24"/>
+          <w:rtl w:val="0"/>
+        </w:rPr>
+        <w:t xml:space="preserve">Repositório:</w:t>
+        <w:br w:type="textWrapping"/>
+      </w:r>
+      <w:hyperlink r:id="rId9">
+        <w:r>
+          <w:rPr>
+            <w:color w:val="1155cc"/>
+            <w:sz w:val="24"/>
+            <w:szCs w:val="24"/>
+            <w:u w:val="single"/>
+            <w:rtl w:val="0"/>
+          </w:rPr>
+          <w:t xml:space="preserve">https://github.com/RydeyADS/PHB-Vagas</w:t>
+        </w:r>
+      </w:hyperlink>
+      <w:r>
+        <w:rPr>
+          <w:rtl w:val="0"/>
+        </w:rPr>
+      </w:r>
+    </w:p>
+    <w:p>
+      <w:pPr>
+        <w:spacing w:after="240" w:before="240" w:line="360" w:lineRule="auto"/>
+        <w:jc w:val="both"/>
+        <w:rPr>
+          <w:color w:val="1155cc"/>
+          <w:sz w:val="24"/>
+          <w:szCs w:val="24"/>
+          <w:u w:val="single"/>
+        </w:rPr>
+      </w:pPr>
+      <w:r>
+        <w:rPr>
+          <w:rtl w:val="0"/>
+        </w:rPr>
+      </w:r>
+    </w:p>
+    <w:p>
+      <w:pPr>
+        <w:spacing w:after="240" w:before="240" w:line="360" w:lineRule="auto"/>
+        <w:jc w:val="both"/>
+        <w:rPr>
+          <w:color w:val="1155cc"/>
+          <w:sz w:val="24"/>
+          <w:szCs w:val="24"/>
+          <w:u w:val="single"/>
+        </w:rPr>
+      </w:pPr>
+      <w:r>
+        <w:rPr>
+          <w:rtl w:val="0"/>
+        </w:rPr>
+      </w:r>
+    </w:p>
+    <w:p>
+      <w:pPr>
+        <w:spacing w:after="240" w:before="240" w:line="360" w:lineRule="auto"/>
+        <w:jc w:val="both"/>
+        <w:rPr>
+          <w:color w:val="1155cc"/>
+          <w:sz w:val="24"/>
+          <w:szCs w:val="24"/>
+          <w:u w:val="single"/>
+        </w:rPr>
+      </w:pPr>
+      <w:r>
+        <w:rPr>
+          <w:rtl w:val="0"/>
+        </w:rPr>
+      </w:r>
+    </w:p>
+    <w:p>
+      <w:pPr>
+        <w:spacing w:after="240" w:before="240" w:line="360" w:lineRule="auto"/>
+        <w:jc w:val="both"/>
+        <w:rPr>
+          <w:color w:val="1155cc"/>
+          <w:sz w:val="24"/>
+          <w:szCs w:val="24"/>
+          <w:u w:val="single"/>
+        </w:rPr>
+      </w:pPr>
+      <w:r>
+        <w:rPr>
+          <w:rtl w:val="0"/>
+        </w:rPr>
+      </w:r>
+    </w:p>
+    <w:p>
+      <w:pPr>
+        <w:spacing w:after="240" w:before="240" w:line="360" w:lineRule="auto"/>
+        <w:jc w:val="both"/>
+        <w:rPr>
+          <w:color w:val="1155cc"/>
+          <w:sz w:val="24"/>
+          <w:szCs w:val="24"/>
+          <w:u w:val="single"/>
+        </w:rPr>
+      </w:pPr>
+      <w:r>
+        <w:rPr>
+          <w:rtl w:val="0"/>
+        </w:rPr>
+      </w:r>
+    </w:p>
+    <w:p>
+      <w:pPr>
+        <w:spacing w:after="240" w:before="240" w:line="360" w:lineRule="auto"/>
+        <w:jc w:val="both"/>
+        <w:rPr>
+          <w:color w:val="1155cc"/>
+          <w:sz w:val="24"/>
+          <w:szCs w:val="24"/>
+          <w:u w:val="single"/>
+        </w:rPr>
+      </w:pPr>
+      <w:r>
+        <w:rPr>
+          <w:rtl w:val="0"/>
+        </w:rPr>
+      </w:r>
+    </w:p>
+    <w:p>
+      <w:pPr>
+        <w:spacing w:after="240" w:before="240" w:line="360" w:lineRule="auto"/>
+        <w:ind w:firstLine="720"/>
+        <w:jc w:val="both"/>
+        <w:rPr>
+          <w:sz w:val="24"/>
+          <w:szCs w:val="24"/>
+        </w:rPr>
+      </w:pPr>
+      <w:r>
+        <w:rPr>
+          <w:rtl w:val="0"/>
+        </w:rPr>
+      </w:r>
+    </w:p>
+    <w:p>
+      <w:pPr>
         <w:spacing w:after="240" w:before="240" w:line="360" w:lineRule="auto"/>
         <w:ind w:firstLine="720"/>
         <w:jc w:val="both"/>
@@ -2527,158 +2728,8 @@
           <w:szCs w:val="46"/>
         </w:rPr>
       </w:pPr>
-      <w:bookmarkStart w:colFirst="0" w:colLast="0" w:name="_l6a0bmfg6dto" w:id="22"/>
-      <w:bookmarkEnd w:id="22"/>
-      <w:r>
-        <w:rPr>
-          <w:rtl w:val="0"/>
-        </w:rPr>
-      </w:r>
-    </w:p>
-    <w:p>
-      <w:pPr>
-        <w:rPr/>
-      </w:pPr>
-      <w:r>
-        <w:rPr>
-          <w:rtl w:val="0"/>
-        </w:rPr>
-      </w:r>
-    </w:p>
-    <w:p>
-      <w:pPr>
-        <w:rPr/>
-      </w:pPr>
-      <w:r>
-        <w:rPr>
-          <w:rtl w:val="0"/>
-        </w:rPr>
-      </w:r>
-    </w:p>
-    <w:p>
-      <w:pPr>
-        <w:rPr/>
-      </w:pPr>
-      <w:r>
-        <w:rPr>
-          <w:rtl w:val="0"/>
-        </w:rPr>
-      </w:r>
-    </w:p>
-    <w:p>
-      <w:pPr>
-        <w:rPr/>
-      </w:pPr>
-      <w:r>
-        <w:rPr>
-          <w:rtl w:val="0"/>
-        </w:rPr>
-      </w:r>
-    </w:p>
-    <w:p>
-      <w:pPr>
-        <w:rPr/>
-      </w:pPr>
-      <w:r>
-        <w:rPr>
-          <w:rtl w:val="0"/>
-        </w:rPr>
-      </w:r>
-    </w:p>
-    <w:p>
-      <w:pPr>
-        <w:rPr/>
-      </w:pPr>
-      <w:r>
-        <w:rPr>
-          <w:rtl w:val="0"/>
-        </w:rPr>
-      </w:r>
-    </w:p>
-    <w:p>
-      <w:pPr>
-        <w:rPr/>
-      </w:pPr>
-      <w:r>
-        <w:rPr>
-          <w:rtl w:val="0"/>
-        </w:rPr>
-      </w:r>
-    </w:p>
-    <w:p>
-      <w:pPr>
-        <w:rPr/>
-      </w:pPr>
-      <w:r>
-        <w:rPr>
-          <w:rtl w:val="0"/>
-        </w:rPr>
-      </w:r>
-    </w:p>
-    <w:p>
-      <w:pPr>
-        <w:rPr/>
-      </w:pPr>
-      <w:r>
-        <w:rPr>
-          <w:rtl w:val="0"/>
-        </w:rPr>
-      </w:r>
-    </w:p>
-    <w:p>
-      <w:pPr>
-        <w:rPr/>
-      </w:pPr>
-      <w:r>
-        <w:rPr>
-          <w:rtl w:val="0"/>
-        </w:rPr>
-      </w:r>
-    </w:p>
-    <w:p>
-      <w:pPr>
-        <w:rPr/>
-      </w:pPr>
-      <w:r>
-        <w:rPr>
-          <w:rtl w:val="0"/>
-        </w:rPr>
-      </w:r>
-    </w:p>
-    <w:p>
-      <w:pPr>
-        <w:rPr/>
-      </w:pPr>
-      <w:r>
-        <w:rPr>
-          <w:rtl w:val="0"/>
-        </w:rPr>
-      </w:r>
-    </w:p>
-    <w:p>
-      <w:pPr>
-        <w:rPr/>
-      </w:pPr>
-      <w:r>
-        <w:rPr>
-          <w:rtl w:val="0"/>
-        </w:rPr>
-      </w:r>
-    </w:p>
-    <w:p>
-      <w:pPr>
-        <w:rPr/>
-      </w:pPr>
-      <w:r>
-        <w:rPr>
-          <w:rtl w:val="0"/>
-        </w:rPr>
-      </w:r>
-    </w:p>
-    <w:p>
-      <w:pPr>
-        <w:rPr/>
-      </w:pPr>
+      <w:bookmarkStart w:colFirst="0" w:colLast="0" w:name="_cct1ysr89g7p" w:id="23"/>
+      <w:bookmarkEnd w:id="23"/>
       <w:r>
         <w:rPr>
           <w:rtl w:val="0"/>
@@ -2698,77 +2749,14 @@
           <w:szCs w:val="46"/>
         </w:rPr>
       </w:pPr>
-      <w:bookmarkStart w:colFirst="0" w:colLast="0" w:name="_3jyf4i3as33i" w:id="23"/>
-      <w:bookmarkEnd w:id="23"/>
-      <w:r>
-        <w:rPr>
-          <w:rtl w:val="0"/>
-        </w:rPr>
-      </w:r>
-    </w:p>
-    <w:p>
-      <w:pPr>
-        <w:pStyle w:val="Heading1"/>
-        <w:keepNext w:val="0"/>
-        <w:keepLines w:val="0"/>
-        <w:spacing w:before="480" w:lineRule="auto"/>
+      <w:bookmarkStart w:colFirst="0" w:colLast="0" w:name="_ej0vena6k0hn" w:id="24"/>
+      <w:bookmarkEnd w:id="24"/>
+      <w:r>
         <w:rPr>
           <w:b w:val="1"/>
           <w:bCs w:val="1"/>
           <w:sz w:val="46"/>
           <w:szCs w:val="46"/>
-        </w:rPr>
-      </w:pPr>
-      <w:bookmarkStart w:colFirst="0" w:colLast="0" w:name="_d7oncsfg6mh8" w:id="24"/>
-      <w:bookmarkEnd w:id="24"/>
-      <w:r>
-        <w:rPr>
-          <w:rtl w:val="0"/>
-        </w:rPr>
-      </w:r>
-    </w:p>
-    <w:p>
-      <w:pPr>
-        <w:pStyle w:val="Heading1"/>
-        <w:keepNext w:val="0"/>
-        <w:keepLines w:val="0"/>
-        <w:spacing w:before="480" w:lineRule="auto"/>
-        <w:rPr>
-          <w:b w:val="1"/>
-          <w:bCs w:val="1"/>
-          <w:sz w:val="46"/>
-          <w:szCs w:val="46"/>
-        </w:rPr>
-      </w:pPr>
-      <w:bookmarkStart w:colFirst="0" w:colLast="0" w:name="_s2joav26hwu" w:id="25"/>
-      <w:bookmarkEnd w:id="25"/>
-      <w:r>
-        <w:rPr>
-          <w:rtl w:val="0"/>
-        </w:rPr>
-      </w:r>
-    </w:p>
-    <w:p>
-      <w:pPr>
-        <w:pStyle w:val="Heading1"/>
-        <w:keepNext w:val="0"/>
-        <w:keepLines w:val="0"/>
-        <w:spacing w:before="480" w:lineRule="auto"/>
-        <w:rPr>
-          <w:b w:val="1"/>
-          <w:bCs w:val="1"/>
-          <w:sz w:val="46"/>
-          <w:szCs w:val="46"/>
-        </w:rPr>
-      </w:pPr>
-      <w:bookmarkStart w:colFirst="0" w:colLast="0" w:name="_ej0vena6k0hn" w:id="26"/>
-      <w:bookmarkEnd w:id="26"/>
-      <w:r>
-        <w:rPr>
-          <w:b w:val="1"/>
-          <w:bCs w:val="1"/>
-          <w:sz w:val="46"/>
-          <w:szCs w:val="46"/>
           <w:rtl w:val="0"/>
         </w:rPr>
         <w:t xml:space="preserve">REFERÊNCIAS</w:t>
@@ -2841,7 +2829,7 @@
         </w:rPr>
         <w:t xml:space="preserve">BOOTSTRAP. Documentation. Disponível em:</w:t>
       </w:r>
-      <w:hyperlink r:id="rId9">
+      <w:hyperlink r:id="rId10">
         <w:r>
           <w:rPr>
             <w:sz w:val="24"/>
@@ -2851,7 +2839,7 @@
           <w:t xml:space="preserve"> </w:t>
         </w:r>
       </w:hyperlink>
-      <w:hyperlink r:id="rId10">
+      <w:hyperlink r:id="rId11">
         <w:r>
           <w:rPr>
             <w:color w:val="1155cc"/>
@@ -2888,7 +2876,7 @@
         </w:rPr>
         <w:t xml:space="preserve">VITE. Documentation. Disponível em:</w:t>
       </w:r>
-      <w:hyperlink r:id="rId11">
+      <w:hyperlink r:id="rId12">
         <w:r>
           <w:rPr>
             <w:sz w:val="24"/>
@@ -2898,7 +2886,7 @@
           <w:t xml:space="preserve"> </w:t>
         </w:r>
       </w:hyperlink>
-      <w:hyperlink r:id="rId12">
+      <w:hyperlink r:id="rId13">
         <w:r>
           <w:rPr>
             <w:color w:val="1155cc"/>
@@ -2935,7 +2923,7 @@
         </w:rPr>
         <w:t xml:space="preserve">W3C. HTML5 Specification. Disponível em:</w:t>
       </w:r>
-      <w:hyperlink r:id="rId13">
+      <w:hyperlink r:id="rId14">
         <w:r>
           <w:rPr>
             <w:sz w:val="24"/>
@@ -2945,7 +2933,7 @@
           <w:t xml:space="preserve"> </w:t>
         </w:r>
       </w:hyperlink>
-      <w:hyperlink r:id="rId14">
+      <w:hyperlink r:id="rId15">
         <w:r>
           <w:rPr>
             <w:color w:val="1155cc"/>

</xml_diff>